<commit_message>
Update Monday checklist: add "After go-live — good to know"
Covers the newer operational features for the admin's first day: Form Builder
field/section hiding, per-student certificate assessor override, Settings →
Backups, the app:check health check, and user:password. Regenerated the .docx.

Co-Authored-By: Claude Opus 4.8 (1M context) <noreply@anthropic.com>
</commit_message>
<xml_diff>
--- a/deploy/local/MONDAY-CHECKLIST.docx
+++ b/deploy/local/MONDAY-CHECKLIST.docx
@@ -458,6 +458,79 @@
           <w:color w:val="15366B"/>
           <w:sz w:val="30"/>
         </w:rPr>
+        <w:t xml:space="preserve">After go-live — good to know</w:t>
+      </w:r>
+    </w:p>
+    <w:p>
+      <w:pPr>
+        <w:spacing w:before="0" w:after="40"/>
+        <w:ind w:left="360"/>
+      </w:pPr>
+      <w:r>
+        <w:t xml:space="preserve">•  </w:t>
+      </w:r>
+      <w:r>
+        <w:t xml:space="preserve">Customize the form: Settings - Form Builder. Hide a field (pencil - untick "Show this field on the form") or hide a whole section. The 5 padlocked fields (Last name, First name, Barangay, Contact no., Sex) can be renamed but not hidden.</w:t>
+      </w:r>
+    </w:p>
+    <w:p>
+      <w:pPr>
+        <w:spacing w:before="0" w:after="40"/>
+        <w:ind w:left="360"/>
+      </w:pPr>
+      <w:r>
+        <w:t xml:space="preserve">•  </w:t>
+      </w:r>
+      <w:r>
+        <w:t xml:space="preserve">Certificate assessor: set the default in Settings - Signatories. Override it per student in Assessment &amp; certs (pencil in the Assessor column) — Admin, Secretary, Registrar and Training Coordinator can edit it.</w:t>
+      </w:r>
+    </w:p>
+    <w:p>
+      <w:pPr>
+        <w:spacing w:before="0" w:after="40"/>
+        <w:ind w:left="360"/>
+      </w:pPr>
+      <w:r>
+        <w:t xml:space="preserve">•  </w:t>
+      </w:r>
+      <w:r>
+        <w:t xml:space="preserve">Backups: view / run / download them in Settings - Backups; the daily time is set there too.</w:t>
+      </w:r>
+    </w:p>
+    <w:p>
+      <w:pPr>
+        <w:spacing w:before="0" w:after="40"/>
+        <w:ind w:left="360"/>
+      </w:pPr>
+      <w:r>
+        <w:t xml:space="preserve">•  </w:t>
+      </w:r>
+      <w:r>
+        <w:t xml:space="preserve">Health check anytime: php artisan app:check (or deploy\local\check.bat) diagnoses the install.</w:t>
+      </w:r>
+    </w:p>
+    <w:p>
+      <w:pPr>
+        <w:spacing w:before="0" w:after="40"/>
+        <w:ind w:left="360"/>
+      </w:pPr>
+      <w:r>
+        <w:t xml:space="preserve">•  </w:t>
+      </w:r>
+      <w:r>
+        <w:t xml:space="preserve">Forgot a login password? On the server: php artisan user:password</w:t>
+      </w:r>
+    </w:p>
+    <w:p>
+      <w:pPr>
+        <w:spacing w:before="240" w:after="80"/>
+      </w:pPr>
+      <w:r>
+        <w:rPr>
+          <w:b/>
+          <w:color w:val="15366B"/>
+          <w:sz w:val="30"/>
+        </w:rPr>
         <w:t xml:space="preserve">Keep in mind</w:t>
       </w:r>
     </w:p>
@@ -483,18 +556,6 @@
       </w:r>
       <w:r>
         <w:t xml:space="preserve">Copy backups off this PC regularly: storage\backups\*.enc - a USB drive or another computer.</w:t>
-      </w:r>
-    </w:p>
-    <w:p>
-      <w:pPr>
-        <w:spacing w:before="0" w:after="40"/>
-        <w:ind w:left="360"/>
-      </w:pPr>
-      <w:r>
-        <w:t xml:space="preserve">•  </w:t>
-      </w:r>
-      <w:r>
-        <w:t xml:space="preserve">Forgot a login password? On the server: php artisan user:password</w:t>
       </w:r>
     </w:p>
     <w:p>

</xml_diff>